<commit_message>
mi pan sususum sususum
mipan akakus ñam ñam ñam
</commit_message>
<xml_diff>
--- a/ñiñiñi.docx
+++ b/ñiñiñi.docx
@@ -1,6 +1,6 @@
 
 <file path=word/document.xml><?xml version="1.0" encoding="utf-8"?>
-<w:document xmlns:wpc="http://schemas.microsoft.com/office/word/2010/wordprocessingCanvas" xmlns:cx="http://schemas.microsoft.com/office/drawing/2014/chartex" xmlns:mc="http://schemas.openxmlformats.org/markup-compatibility/2006" xmlns:o="urn:schemas-microsoft-com:office:office" xmlns:r="http://schemas.openxmlformats.org/officeDocument/2006/relationships" xmlns:m="http://schemas.openxmlformats.org/officeDocument/2006/math" xmlns:v="urn:schemas-microsoft-com:vml" xmlns:wp14="http://schemas.microsoft.com/office/word/2010/wordprocessingDrawing" xmlns:wp="http://schemas.openxmlformats.org/drawingml/2006/wordprocessingDrawing" xmlns:w10="urn:schemas-microsoft-com:office:word" xmlns:w="http://schemas.openxmlformats.org/wordprocessingml/2006/main" xmlns:w14="http://schemas.microsoft.com/office/word/2010/wordml" xmlns:w15="http://schemas.microsoft.com/office/word/2012/wordml" xmlns:w16se="http://schemas.microsoft.com/office/word/2015/wordml/symex" xmlns:wpg="http://schemas.microsoft.com/office/word/2010/wordprocessingGroup" xmlns:wpi="http://schemas.microsoft.com/office/word/2010/wordprocessingInk" xmlns:wne="http://schemas.microsoft.com/office/word/2006/wordml" xmlns:wps="http://schemas.microsoft.com/office/word/2010/wordprocessingShape" mc:Ignorable="w14 w15 w16se wp14">
+<w:document xmlns:wpc="http://schemas.microsoft.com/office/word/2010/wordprocessingCanvas" xmlns:cx="http://schemas.microsoft.com/office/drawing/2014/chartex" xmlns:cx1="http://schemas.microsoft.com/office/drawing/2015/9/8/chartex" xmlns:cx2="http://schemas.microsoft.com/office/drawing/2015/10/21/chartex" xmlns:cx3="http://schemas.microsoft.com/office/drawing/2016/5/9/chartex" xmlns:cx4="http://schemas.microsoft.com/office/drawing/2016/5/10/chartex" xmlns:cx5="http://schemas.microsoft.com/office/drawing/2016/5/11/chartex" xmlns:cx6="http://schemas.microsoft.com/office/drawing/2016/5/12/chartex" xmlns:cx7="http://schemas.microsoft.com/office/drawing/2016/5/13/chartex" xmlns:cx8="http://schemas.microsoft.com/office/drawing/2016/5/14/chartex" xmlns:mc="http://schemas.openxmlformats.org/markup-compatibility/2006" xmlns:aink="http://schemas.microsoft.com/office/drawing/2016/ink" xmlns:am3d="http://schemas.microsoft.com/office/drawing/2017/model3d" xmlns:o="urn:schemas-microsoft-com:office:office" xmlns:oel="http://schemas.microsoft.com/office/2019/extlst" xmlns:r="http://schemas.openxmlformats.org/officeDocument/2006/relationships" xmlns:m="http://schemas.openxmlformats.org/officeDocument/2006/math" xmlns:v="urn:schemas-microsoft-com:vml" xmlns:wp14="http://schemas.microsoft.com/office/word/2010/wordprocessingDrawing" xmlns:wp="http://schemas.openxmlformats.org/drawingml/2006/wordprocessingDrawing" xmlns:w10="urn:schemas-microsoft-com:office:word" xmlns:w="http://schemas.openxmlformats.org/wordprocessingml/2006/main" xmlns:w14="http://schemas.microsoft.com/office/word/2010/wordml" xmlns:w15="http://schemas.microsoft.com/office/word/2012/wordml" xmlns:w16cex="http://schemas.microsoft.com/office/word/2018/wordml/cex" xmlns:w16cid="http://schemas.microsoft.com/office/word/2016/wordml/cid" xmlns:w16="http://schemas.microsoft.com/office/word/2018/wordml" xmlns:w16sdtdh="http://schemas.microsoft.com/office/word/2020/wordml/sdtdatahash" xmlns:w16se="http://schemas.microsoft.com/office/word/2015/wordml/symex" xmlns:wpg="http://schemas.microsoft.com/office/word/2010/wordprocessingGroup" xmlns:wpi="http://schemas.microsoft.com/office/word/2010/wordprocessingInk" xmlns:wne="http://schemas.microsoft.com/office/word/2006/wordml" xmlns:wps="http://schemas.microsoft.com/office/word/2010/wordprocessingShape" mc:Ignorable="w14 w15 w16se w16cid w16 w16cex w16sdtdh wp14">
   <w:body>
     <w:p>
       <w:r>
@@ -14,56 +14,14 @@
     </w:p>
     <w:p>
       <w:r>
+        <w:rPr>
+          <w:noProof/>
+        </w:rPr>
         <w:drawing>
-          <wp:inline distT="0" distB="0" distL="0" distR="0" wp14:anchorId="0925FD42" wp14:editId="5EDEB13A">
+          <wp:inline distT="0" distB="0" distL="0" distR="0" wp14:anchorId="4EB8DEEA" wp14:editId="254C9A71">
             <wp:extent cx="4734586" cy="5506218"/>
             <wp:effectExtent l="0" t="0" r="8890" b="0"/>
             <wp:docPr id="1" name="Imagen 1"/>
-            <wp:cNvGraphicFramePr>
-              <a:graphicFrameLocks xmlns:a="http://schemas.openxmlformats.org/drawingml/2006/main" noChangeAspect="1"/>
-            </wp:cNvGraphicFramePr>
-            <a:graphic xmlns:a="http://schemas.openxmlformats.org/drawingml/2006/main">
-              <a:graphicData uri="http://schemas.openxmlformats.org/drawingml/2006/picture">
-                <pic:pic xmlns:pic="http://schemas.openxmlformats.org/drawingml/2006/picture">
-                  <pic:nvPicPr>
-                    <pic:cNvPr id="1" name=""/>
-                    <pic:cNvPicPr/>
-                  </pic:nvPicPr>
-                  <pic:blipFill>
-                    <a:blip r:embed="rId4"/>
-                    <a:stretch>
-                      <a:fillRect/>
-                    </a:stretch>
-                  </pic:blipFill>
-                  <pic:spPr>
-                    <a:xfrm>
-                      <a:off x="0" y="0"/>
-                      <a:ext cx="4734586" cy="5506218"/>
-                    </a:xfrm>
-                    <a:prstGeom prst="rect">
-                      <a:avLst/>
-                    </a:prstGeom>
-                  </pic:spPr>
-                </pic:pic>
-              </a:graphicData>
-            </a:graphic>
-          </wp:inline>
-        </w:drawing>
-      </w:r>
-    </w:p>
-    <w:p>
-      <w:r>
-        <w:t>2-Listar todas las mesas con su número, capacidad y ubicación</w:t>
-      </w:r>
-    </w:p>
-    <w:p>
-      <w:r>
-        <w:lastRenderedPageBreak/>
-        <w:drawing>
-          <wp:inline distT="0" distB="0" distL="0" distR="0" wp14:anchorId="4DBC3B2B" wp14:editId="13692418">
-            <wp:extent cx="4896533" cy="5153744"/>
-            <wp:effectExtent l="0" t="0" r="0" b="8890"/>
-            <wp:docPr id="2" name="Imagen 2"/>
             <wp:cNvGraphicFramePr>
               <a:graphicFrameLocks xmlns:a="http://schemas.openxmlformats.org/drawingml/2006/main" noChangeAspect="1"/>
             </wp:cNvGraphicFramePr>
@@ -83,7 +41,7 @@
                   <pic:spPr>
                     <a:xfrm>
                       <a:off x="0" y="0"/>
-                      <a:ext cx="4896533" cy="5153744"/>
+                      <a:ext cx="4734586" cy="5506218"/>
                     </a:xfrm>
                     <a:prstGeom prst="rect">
                       <a:avLst/>
@@ -98,17 +56,20 @@
     </w:p>
     <w:p>
       <w:r>
-        <w:t>3-Mostrar los platillos con sus precios ordenados de mayor a menor</w:t>
-      </w:r>
-    </w:p>
-    <w:p>
-      <w:r>
+        <w:t>2-Listar todas las mesas con su número, capacidad y ubicación</w:t>
+      </w:r>
+    </w:p>
+    <w:p>
+      <w:r>
+        <w:rPr>
+          <w:noProof/>
+        </w:rPr>
         <w:lastRenderedPageBreak/>
         <w:drawing>
-          <wp:inline distT="0" distB="0" distL="0" distR="0" wp14:anchorId="6CDC3C0A" wp14:editId="70B1473B">
-            <wp:extent cx="5039428" cy="5277587"/>
-            <wp:effectExtent l="0" t="0" r="8890" b="0"/>
-            <wp:docPr id="3" name="Imagen 3"/>
+          <wp:inline distT="0" distB="0" distL="0" distR="0" wp14:anchorId="06CD95F4" wp14:editId="17FE6E43">
+            <wp:extent cx="4896533" cy="5153744"/>
+            <wp:effectExtent l="0" t="0" r="0" b="8890"/>
+            <wp:docPr id="2" name="Imagen 2"/>
             <wp:cNvGraphicFramePr>
               <a:graphicFrameLocks xmlns:a="http://schemas.openxmlformats.org/drawingml/2006/main" noChangeAspect="1"/>
             </wp:cNvGraphicFramePr>
@@ -128,7 +89,7 @@
                   <pic:spPr>
                     <a:xfrm>
                       <a:off x="0" y="0"/>
-                      <a:ext cx="5039428" cy="5277587"/>
+                      <a:ext cx="4896533" cy="5153744"/>
                     </a:xfrm>
                     <a:prstGeom prst="rect">
                       <a:avLst/>
@@ -143,17 +104,20 @@
     </w:p>
     <w:p>
       <w:r>
-        <w:t>4-Listar todas las categorías disponibles</w:t>
-      </w:r>
-    </w:p>
-    <w:p>
-      <w:r>
+        <w:t>3-Mostrar los platillos con sus precios ordenados de mayor a menor</w:t>
+      </w:r>
+    </w:p>
+    <w:p>
+      <w:r>
+        <w:rPr>
+          <w:noProof/>
+        </w:rPr>
         <w:lastRenderedPageBreak/>
         <w:drawing>
-          <wp:inline distT="0" distB="0" distL="0" distR="0" wp14:anchorId="1B7D7539" wp14:editId="37E9A51A">
-            <wp:extent cx="3972479" cy="5325218"/>
-            <wp:effectExtent l="0" t="0" r="9525" b="8890"/>
-            <wp:docPr id="4" name="Imagen 4"/>
+          <wp:inline distT="0" distB="0" distL="0" distR="0" wp14:anchorId="16D8B1CC" wp14:editId="12298E18">
+            <wp:extent cx="5039428" cy="5277587"/>
+            <wp:effectExtent l="0" t="0" r="8890" b="0"/>
+            <wp:docPr id="3" name="Imagen 3"/>
             <wp:cNvGraphicFramePr>
               <a:graphicFrameLocks xmlns:a="http://schemas.openxmlformats.org/drawingml/2006/main" noChangeAspect="1"/>
             </wp:cNvGraphicFramePr>
@@ -173,7 +137,7 @@
                   <pic:spPr>
                     <a:xfrm>
                       <a:off x="0" y="0"/>
-                      <a:ext cx="3972479" cy="5325218"/>
+                      <a:ext cx="5039428" cy="5277587"/>
                     </a:xfrm>
                     <a:prstGeom prst="rect">
                       <a:avLst/>
@@ -188,17 +152,20 @@
     </w:p>
     <w:p>
       <w:r>
-        <w:t>5-Mostrar todos los proveedores con su número y su correo electrónico</w:t>
-      </w:r>
-    </w:p>
-    <w:p>
-      <w:r>
+        <w:t>4-Listar todas las categorías disponibles</w:t>
+      </w:r>
+    </w:p>
+    <w:p>
+      <w:r>
+        <w:rPr>
+          <w:noProof/>
+        </w:rPr>
         <w:lastRenderedPageBreak/>
         <w:drawing>
-          <wp:inline distT="0" distB="0" distL="0" distR="0" wp14:anchorId="70E5EE6B" wp14:editId="76C0CD06">
-            <wp:extent cx="5612130" cy="3746500"/>
-            <wp:effectExtent l="0" t="0" r="7620" b="6350"/>
-            <wp:docPr id="5" name="Imagen 5"/>
+          <wp:inline distT="0" distB="0" distL="0" distR="0" wp14:anchorId="5F3CDDEC" wp14:editId="3D1A9135">
+            <wp:extent cx="3972479" cy="5325218"/>
+            <wp:effectExtent l="0" t="0" r="9525" b="8890"/>
+            <wp:docPr id="4" name="Imagen 4"/>
             <wp:cNvGraphicFramePr>
               <a:graphicFrameLocks xmlns:a="http://schemas.openxmlformats.org/drawingml/2006/main" noChangeAspect="1"/>
             </wp:cNvGraphicFramePr>
@@ -218,7 +185,7 @@
                   <pic:spPr>
                     <a:xfrm>
                       <a:off x="0" y="0"/>
-                      <a:ext cx="5612130" cy="3746500"/>
+                      <a:ext cx="3972479" cy="5325218"/>
                     </a:xfrm>
                     <a:prstGeom prst="rect">
                       <a:avLst/>
@@ -233,17 +200,20 @@
     </w:p>
     <w:p>
       <w:r>
-        <w:t>6-Listar los ingredientes indicando su unidad de medida y stock actual</w:t>
-      </w:r>
-    </w:p>
-    <w:p>
-      <w:r>
+        <w:t>5-Mostrar todos los proveedores con su número y su correo electrónico</w:t>
+      </w:r>
+    </w:p>
+    <w:p>
+      <w:r>
+        <w:rPr>
+          <w:noProof/>
+        </w:rPr>
         <w:lastRenderedPageBreak/>
         <w:drawing>
-          <wp:inline distT="0" distB="0" distL="0" distR="0" wp14:anchorId="0BC469AA" wp14:editId="60612683">
-            <wp:extent cx="5477639" cy="5106113"/>
-            <wp:effectExtent l="0" t="0" r="8890" b="0"/>
-            <wp:docPr id="6" name="Imagen 6"/>
+          <wp:inline distT="0" distB="0" distL="0" distR="0" wp14:anchorId="3F417C5D" wp14:editId="4E4CDB05">
+            <wp:extent cx="5612130" cy="3746500"/>
+            <wp:effectExtent l="0" t="0" r="7620" b="6350"/>
+            <wp:docPr id="5" name="Imagen 5"/>
             <wp:cNvGraphicFramePr>
               <a:graphicFrameLocks xmlns:a="http://schemas.openxmlformats.org/drawingml/2006/main" noChangeAspect="1"/>
             </wp:cNvGraphicFramePr>
@@ -263,7 +233,7 @@
                   <pic:spPr>
                     <a:xfrm>
                       <a:off x="0" y="0"/>
-                      <a:ext cx="5477639" cy="5106113"/>
+                      <a:ext cx="5612130" cy="3746500"/>
                     </a:xfrm>
                     <a:prstGeom prst="rect">
                       <a:avLst/>
@@ -278,16 +248,20 @@
     </w:p>
     <w:p>
       <w:r>
-        <w:t>7-Mostrar todas las ordenes con estado ‘cancelada’</w:t>
-      </w:r>
-    </w:p>
-    <w:p>
-      <w:r>
+        <w:t>6-Listar los ingredientes indicando su unidad de medida y stock actual</w:t>
+      </w:r>
+    </w:p>
+    <w:p>
+      <w:r>
+        <w:rPr>
+          <w:noProof/>
+        </w:rPr>
+        <w:lastRenderedPageBreak/>
         <w:drawing>
-          <wp:inline distT="0" distB="0" distL="0" distR="0" wp14:anchorId="3AAB440F" wp14:editId="0CD4DAF8">
-            <wp:extent cx="5612130" cy="1770380"/>
-            <wp:effectExtent l="0" t="0" r="7620" b="1270"/>
-            <wp:docPr id="7" name="Imagen 7"/>
+          <wp:inline distT="0" distB="0" distL="0" distR="0" wp14:anchorId="757B237C" wp14:editId="100D2FA1">
+            <wp:extent cx="5477639" cy="5106113"/>
+            <wp:effectExtent l="0" t="0" r="8890" b="0"/>
+            <wp:docPr id="6" name="Imagen 6"/>
             <wp:cNvGraphicFramePr>
               <a:graphicFrameLocks xmlns:a="http://schemas.openxmlformats.org/drawingml/2006/main" noChangeAspect="1"/>
             </wp:cNvGraphicFramePr>
@@ -307,7 +281,7 @@
                   <pic:spPr>
                     <a:xfrm>
                       <a:off x="0" y="0"/>
-                      <a:ext cx="5612130" cy="1770380"/>
+                      <a:ext cx="5477639" cy="5106113"/>
                     </a:xfrm>
                     <a:prstGeom prst="rect">
                       <a:avLst/>
@@ -322,17 +296,19 @@
     </w:p>
     <w:p>
       <w:r>
-        <w:t>8-Listar los platillos cuyo precio sea menor a $100</w:t>
-      </w:r>
-    </w:p>
-    <w:p>
-      <w:r>
-        <w:lastRenderedPageBreak/>
+        <w:t>7-Mostrar todas las ordenes con estado ‘cancelada’</w:t>
+      </w:r>
+    </w:p>
+    <w:p>
+      <w:r>
+        <w:rPr>
+          <w:noProof/>
+        </w:rPr>
         <w:drawing>
-          <wp:inline distT="0" distB="0" distL="0" distR="0" wp14:anchorId="0B78FEC8" wp14:editId="344F2929">
-            <wp:extent cx="5612130" cy="2836545"/>
-            <wp:effectExtent l="0" t="0" r="7620" b="1905"/>
-            <wp:docPr id="8" name="Imagen 8"/>
+          <wp:inline distT="0" distB="0" distL="0" distR="0" wp14:anchorId="64E8F666" wp14:editId="584188C3">
+            <wp:extent cx="5612130" cy="1770380"/>
+            <wp:effectExtent l="0" t="0" r="7620" b="1270"/>
+            <wp:docPr id="7" name="Imagen 7"/>
             <wp:cNvGraphicFramePr>
               <a:graphicFrameLocks xmlns:a="http://schemas.openxmlformats.org/drawingml/2006/main" noChangeAspect="1"/>
             </wp:cNvGraphicFramePr>
@@ -352,7 +328,7 @@
                   <pic:spPr>
                     <a:xfrm>
                       <a:off x="0" y="0"/>
-                      <a:ext cx="5612130" cy="2836545"/>
+                      <a:ext cx="5612130" cy="1770380"/>
                     </a:xfrm>
                     <a:prstGeom prst="rect">
                       <a:avLst/>
@@ -367,16 +343,20 @@
     </w:p>
     <w:p>
       <w:r>
-        <w:t>9-Mostrar los empleados del turno nocturno ordenados por apellido</w:t>
-      </w:r>
-    </w:p>
-    <w:p>
-      <w:r>
+        <w:t>8-Listar los platillos cuyo precio sea menor a $100</w:t>
+      </w:r>
+    </w:p>
+    <w:p>
+      <w:r>
+        <w:rPr>
+          <w:noProof/>
+        </w:rPr>
+        <w:lastRenderedPageBreak/>
         <w:drawing>
-          <wp:inline distT="0" distB="0" distL="0" distR="0" wp14:anchorId="27C07D97" wp14:editId="5D25DBF4">
-            <wp:extent cx="5612130" cy="3265805"/>
-            <wp:effectExtent l="0" t="0" r="7620" b="0"/>
-            <wp:docPr id="9" name="Imagen 9"/>
+          <wp:inline distT="0" distB="0" distL="0" distR="0" wp14:anchorId="65287548" wp14:editId="5C284031">
+            <wp:extent cx="5612130" cy="2836545"/>
+            <wp:effectExtent l="0" t="0" r="7620" b="1905"/>
+            <wp:docPr id="8" name="Imagen 8"/>
             <wp:cNvGraphicFramePr>
               <a:graphicFrameLocks xmlns:a="http://schemas.openxmlformats.org/drawingml/2006/main" noChangeAspect="1"/>
             </wp:cNvGraphicFramePr>
@@ -396,6 +376,53 @@
                   <pic:spPr>
                     <a:xfrm>
                       <a:off x="0" y="0"/>
+                      <a:ext cx="5612130" cy="2836545"/>
+                    </a:xfrm>
+                    <a:prstGeom prst="rect">
+                      <a:avLst/>
+                    </a:prstGeom>
+                  </pic:spPr>
+                </pic:pic>
+              </a:graphicData>
+            </a:graphic>
+          </wp:inline>
+        </w:drawing>
+      </w:r>
+    </w:p>
+    <w:p>
+      <w:r>
+        <w:t>9-Mostrar los empleados del turno nocturno ordenados por apellido</w:t>
+      </w:r>
+    </w:p>
+    <w:p>
+      <w:r>
+        <w:rPr>
+          <w:noProof/>
+        </w:rPr>
+        <w:drawing>
+          <wp:inline distT="0" distB="0" distL="0" distR="0" wp14:anchorId="0F338D5E" wp14:editId="47C30266">
+            <wp:extent cx="5612130" cy="3265805"/>
+            <wp:effectExtent l="0" t="0" r="7620" b="0"/>
+            <wp:docPr id="9" name="Imagen 9"/>
+            <wp:cNvGraphicFramePr>
+              <a:graphicFrameLocks xmlns:a="http://schemas.openxmlformats.org/drawingml/2006/main" noChangeAspect="1"/>
+            </wp:cNvGraphicFramePr>
+            <a:graphic xmlns:a="http://schemas.openxmlformats.org/drawingml/2006/main">
+              <a:graphicData uri="http://schemas.openxmlformats.org/drawingml/2006/picture">
+                <pic:pic xmlns:pic="http://schemas.openxmlformats.org/drawingml/2006/picture">
+                  <pic:nvPicPr>
+                    <pic:cNvPr id="1" name=""/>
+                    <pic:cNvPicPr/>
+                  </pic:nvPicPr>
+                  <pic:blipFill>
+                    <a:blip r:embed="rId13"/>
+                    <a:stretch>
+                      <a:fillRect/>
+                    </a:stretch>
+                  </pic:blipFill>
+                  <pic:spPr>
+                    <a:xfrm>
+                      <a:off x="0" y="0"/>
                       <a:ext cx="5612130" cy="3265805"/>
                     </a:xfrm>
                     <a:prstGeom prst="rect">
@@ -415,8 +442,472 @@
       </w:r>
     </w:p>
     <w:p>
-      <w:bookmarkStart w:id="0" w:name="_GoBack"/>
-      <w:bookmarkEnd w:id="0"/>
+      <w:r>
+        <w:lastRenderedPageBreak/>
+        <w:drawing>
+          <wp:inline distT="0" distB="0" distL="0" distR="0" wp14:anchorId="16EFED89" wp14:editId="489C0A00">
+            <wp:extent cx="5612130" cy="2409825"/>
+            <wp:effectExtent l="0" t="0" r="7620" b="9525"/>
+            <wp:docPr id="10" name="Imagen 10" descr="Interfaz de usuario gráfica, Texto, Aplicación, Correo electrónico&#10;&#10;Descripción generada automáticamente"/>
+            <wp:cNvGraphicFramePr>
+              <a:graphicFrameLocks xmlns:a="http://schemas.openxmlformats.org/drawingml/2006/main" noChangeAspect="1"/>
+            </wp:cNvGraphicFramePr>
+            <a:graphic xmlns:a="http://schemas.openxmlformats.org/drawingml/2006/main">
+              <a:graphicData uri="http://schemas.openxmlformats.org/drawingml/2006/picture">
+                <pic:pic xmlns:pic="http://schemas.openxmlformats.org/drawingml/2006/picture">
+                  <pic:nvPicPr>
+                    <pic:cNvPr id="10" name="Imagen 10" descr="Interfaz de usuario gráfica, Texto, Aplicación, Correo electrónico&#10;&#10;Descripción generada automáticamente"/>
+                    <pic:cNvPicPr/>
+                  </pic:nvPicPr>
+                  <pic:blipFill rotWithShape="1">
+                    <a:blip r:embed="rId14"/>
+                    <a:srcRect t="6328" b="4734"/>
+                    <a:stretch/>
+                  </pic:blipFill>
+                  <pic:spPr bwMode="auto">
+                    <a:xfrm>
+                      <a:off x="0" y="0"/>
+                      <a:ext cx="5612130" cy="2409825"/>
+                    </a:xfrm>
+                    <a:prstGeom prst="rect">
+                      <a:avLst/>
+                    </a:prstGeom>
+                    <a:ln>
+                      <a:noFill/>
+                    </a:ln>
+                    <a:extLst>
+                      <a:ext uri="{53640926-AAD7-44D8-BBD7-CCE9431645EC}">
+                        <a14:shadowObscured xmlns:a14="http://schemas.microsoft.com/office/drawing/2010/main"/>
+                      </a:ext>
+                    </a:extLst>
+                  </pic:spPr>
+                </pic:pic>
+              </a:graphicData>
+            </a:graphic>
+          </wp:inline>
+        </w:drawing>
+      </w:r>
+    </w:p>
+    <w:p>
+      <w:r>
+        <w:t>Consultas 1</w:t>
+      </w:r>
+    </w:p>
+    <w:p>
+      <w:r>
+        <w:t>1-</w:t>
+      </w:r>
+      <w:r>
+        <w:t>Lista de todos los platillos disponibles con su categoría y precio</w:t>
+      </w:r>
+    </w:p>
+    <w:p>
+      <w:r>
+        <w:drawing>
+          <wp:inline distT="0" distB="0" distL="0" distR="0" wp14:anchorId="2FCE9AB8" wp14:editId="5EE7E13D">
+            <wp:extent cx="5612130" cy="2741930"/>
+            <wp:effectExtent l="0" t="0" r="7620" b="1270"/>
+            <wp:docPr id="12" name="Imagen 12" descr="Interfaz de usuario gráfica, Texto, Aplicación, Correo electrónico&#10;&#10;Descripción generada automáticamente"/>
+            <wp:cNvGraphicFramePr>
+              <a:graphicFrameLocks xmlns:a="http://schemas.openxmlformats.org/drawingml/2006/main" noChangeAspect="1"/>
+            </wp:cNvGraphicFramePr>
+            <a:graphic xmlns:a="http://schemas.openxmlformats.org/drawingml/2006/main">
+              <a:graphicData uri="http://schemas.openxmlformats.org/drawingml/2006/picture">
+                <pic:pic xmlns:pic="http://schemas.openxmlformats.org/drawingml/2006/picture">
+                  <pic:nvPicPr>
+                    <pic:cNvPr id="12" name="Imagen 12" descr="Interfaz de usuario gráfica, Texto, Aplicación, Correo electrónico&#10;&#10;Descripción generada automáticamente"/>
+                    <pic:cNvPicPr/>
+                  </pic:nvPicPr>
+                  <pic:blipFill>
+                    <a:blip r:embed="rId15"/>
+                    <a:stretch>
+                      <a:fillRect/>
+                    </a:stretch>
+                  </pic:blipFill>
+                  <pic:spPr>
+                    <a:xfrm>
+                      <a:off x="0" y="0"/>
+                      <a:ext cx="5612130" cy="2741930"/>
+                    </a:xfrm>
+                    <a:prstGeom prst="rect">
+                      <a:avLst/>
+                    </a:prstGeom>
+                  </pic:spPr>
+                </pic:pic>
+              </a:graphicData>
+            </a:graphic>
+          </wp:inline>
+        </w:drawing>
+      </w:r>
+    </w:p>
+    <w:p/>
+    <w:p>
+      <w:r>
+        <w:t>2</w:t>
+      </w:r>
+      <w:r>
+        <w:t>-</w:t>
+      </w:r>
+      <w:r>
+        <w:t xml:space="preserve"> Empleados activos del turno vespertino</w:t>
+      </w:r>
+    </w:p>
+    <w:p>
+      <w:r>
+        <w:lastRenderedPageBreak/>
+        <w:drawing>
+          <wp:inline distT="0" distB="0" distL="0" distR="0" wp14:anchorId="7287D71D" wp14:editId="726A591A">
+            <wp:extent cx="5612130" cy="3486150"/>
+            <wp:effectExtent l="0" t="0" r="7620" b="0"/>
+            <wp:docPr id="14" name="Imagen 14" descr="Interfaz de usuario gráfica, Aplicación&#10;&#10;Descripción generada automáticamente"/>
+            <wp:cNvGraphicFramePr>
+              <a:graphicFrameLocks xmlns:a="http://schemas.openxmlformats.org/drawingml/2006/main" noChangeAspect="1"/>
+            </wp:cNvGraphicFramePr>
+            <a:graphic xmlns:a="http://schemas.openxmlformats.org/drawingml/2006/main">
+              <a:graphicData uri="http://schemas.openxmlformats.org/drawingml/2006/picture">
+                <pic:pic xmlns:pic="http://schemas.openxmlformats.org/drawingml/2006/picture">
+                  <pic:nvPicPr>
+                    <pic:cNvPr id="14" name="Imagen 14" descr="Interfaz de usuario gráfica, Aplicación&#10;&#10;Descripción generada automáticamente"/>
+                    <pic:cNvPicPr/>
+                  </pic:nvPicPr>
+                  <pic:blipFill>
+                    <a:blip r:embed="rId16"/>
+                    <a:stretch>
+                      <a:fillRect/>
+                    </a:stretch>
+                  </pic:blipFill>
+                  <pic:spPr>
+                    <a:xfrm>
+                      <a:off x="0" y="0"/>
+                      <a:ext cx="5612130" cy="3486150"/>
+                    </a:xfrm>
+                    <a:prstGeom prst="rect">
+                      <a:avLst/>
+                    </a:prstGeom>
+                  </pic:spPr>
+                </pic:pic>
+              </a:graphicData>
+            </a:graphic>
+          </wp:inline>
+        </w:drawing>
+      </w:r>
+    </w:p>
+    <w:p>
+      <w:r>
+        <w:t>3</w:t>
+      </w:r>
+      <w:r>
+        <w:t>-</w:t>
+      </w:r>
+      <w:r>
+        <w:t xml:space="preserve"> Ingredientes con stock por debajo del mínimo</w:t>
+      </w:r>
+    </w:p>
+    <w:p>
+      <w:r>
+        <w:drawing>
+          <wp:inline distT="0" distB="0" distL="0" distR="0" wp14:anchorId="533FA4A9" wp14:editId="250236CE">
+            <wp:extent cx="5612130" cy="2022475"/>
+            <wp:effectExtent l="0" t="0" r="7620" b="0"/>
+            <wp:docPr id="15" name="Imagen 15" descr="Interfaz de usuario gráfica, Texto, Aplicación&#10;&#10;Descripción generada automáticamente"/>
+            <wp:cNvGraphicFramePr>
+              <a:graphicFrameLocks xmlns:a="http://schemas.openxmlformats.org/drawingml/2006/main" noChangeAspect="1"/>
+            </wp:cNvGraphicFramePr>
+            <a:graphic xmlns:a="http://schemas.openxmlformats.org/drawingml/2006/main">
+              <a:graphicData uri="http://schemas.openxmlformats.org/drawingml/2006/picture">
+                <pic:pic xmlns:pic="http://schemas.openxmlformats.org/drawingml/2006/picture">
+                  <pic:nvPicPr>
+                    <pic:cNvPr id="15" name="Imagen 15" descr="Interfaz de usuario gráfica, Texto, Aplicación&#10;&#10;Descripción generada automáticamente"/>
+                    <pic:cNvPicPr/>
+                  </pic:nvPicPr>
+                  <pic:blipFill>
+                    <a:blip r:embed="rId17"/>
+                    <a:stretch>
+                      <a:fillRect/>
+                    </a:stretch>
+                  </pic:blipFill>
+                  <pic:spPr>
+                    <a:xfrm>
+                      <a:off x="0" y="0"/>
+                      <a:ext cx="5612130" cy="2022475"/>
+                    </a:xfrm>
+                    <a:prstGeom prst="rect">
+                      <a:avLst/>
+                    </a:prstGeom>
+                  </pic:spPr>
+                </pic:pic>
+              </a:graphicData>
+            </a:graphic>
+          </wp:inline>
+        </w:drawing>
+      </w:r>
+    </w:p>
+    <w:p>
+      <w:r>
+        <w:t>4</w:t>
+      </w:r>
+      <w:r>
+        <w:t>-</w:t>
+      </w:r>
+      <w:r>
+        <w:t xml:space="preserve"> Total de órdenes y monto recaudado por método de pago</w:t>
+      </w:r>
+    </w:p>
+    <w:p>
+      <w:r>
+        <w:lastRenderedPageBreak/>
+        <w:drawing>
+          <wp:inline distT="0" distB="0" distL="0" distR="0" wp14:anchorId="41FA7EFF" wp14:editId="41E6CA0A">
+            <wp:extent cx="5268060" cy="3419952"/>
+            <wp:effectExtent l="0" t="0" r="8890" b="9525"/>
+            <wp:docPr id="16" name="Imagen 16" descr="Interfaz de usuario gráfica, Aplicación&#10;&#10;Descripción generada automáticamente"/>
+            <wp:cNvGraphicFramePr>
+              <a:graphicFrameLocks xmlns:a="http://schemas.openxmlformats.org/drawingml/2006/main" noChangeAspect="1"/>
+            </wp:cNvGraphicFramePr>
+            <a:graphic xmlns:a="http://schemas.openxmlformats.org/drawingml/2006/main">
+              <a:graphicData uri="http://schemas.openxmlformats.org/drawingml/2006/picture">
+                <pic:pic xmlns:pic="http://schemas.openxmlformats.org/drawingml/2006/picture">
+                  <pic:nvPicPr>
+                    <pic:cNvPr id="16" name="Imagen 16" descr="Interfaz de usuario gráfica, Aplicación&#10;&#10;Descripción generada automáticamente"/>
+                    <pic:cNvPicPr/>
+                  </pic:nvPicPr>
+                  <pic:blipFill>
+                    <a:blip r:embed="rId18"/>
+                    <a:stretch>
+                      <a:fillRect/>
+                    </a:stretch>
+                  </pic:blipFill>
+                  <pic:spPr>
+                    <a:xfrm>
+                      <a:off x="0" y="0"/>
+                      <a:ext cx="5268060" cy="3419952"/>
+                    </a:xfrm>
+                    <a:prstGeom prst="rect">
+                      <a:avLst/>
+                    </a:prstGeom>
+                  </pic:spPr>
+                </pic:pic>
+              </a:graphicData>
+            </a:graphic>
+          </wp:inline>
+        </w:drawing>
+      </w:r>
+    </w:p>
+    <w:p>
+      <w:r>
+        <w:t>5</w:t>
+      </w:r>
+      <w:r>
+        <w:t>-</w:t>
+      </w:r>
+      <w:r>
+        <w:t xml:space="preserve"> Mesas disponibles por ubicación y capacidad</w:t>
+      </w:r>
+    </w:p>
+    <w:p>
+      <w:r>
+        <w:lastRenderedPageBreak/>
+        <w:drawing>
+          <wp:inline distT="0" distB="0" distL="0" distR="0" wp14:anchorId="7BA91D8F" wp14:editId="21DFDFB3">
+            <wp:extent cx="4420217" cy="5477639"/>
+            <wp:effectExtent l="0" t="0" r="0" b="0"/>
+            <wp:docPr id="17" name="Imagen 17" descr="Interfaz de usuario gráfica&#10;&#10;Descripción generada automáticamente"/>
+            <wp:cNvGraphicFramePr>
+              <a:graphicFrameLocks xmlns:a="http://schemas.openxmlformats.org/drawingml/2006/main" noChangeAspect="1"/>
+            </wp:cNvGraphicFramePr>
+            <a:graphic xmlns:a="http://schemas.openxmlformats.org/drawingml/2006/main">
+              <a:graphicData uri="http://schemas.openxmlformats.org/drawingml/2006/picture">
+                <pic:pic xmlns:pic="http://schemas.openxmlformats.org/drawingml/2006/picture">
+                  <pic:nvPicPr>
+                    <pic:cNvPr id="17" name="Imagen 17" descr="Interfaz de usuario gráfica&#10;&#10;Descripción generada automáticamente"/>
+                    <pic:cNvPicPr/>
+                  </pic:nvPicPr>
+                  <pic:blipFill>
+                    <a:blip r:embed="rId19"/>
+                    <a:stretch>
+                      <a:fillRect/>
+                    </a:stretch>
+                  </pic:blipFill>
+                  <pic:spPr>
+                    <a:xfrm>
+                      <a:off x="0" y="0"/>
+                      <a:ext cx="4420217" cy="5477639"/>
+                    </a:xfrm>
+                    <a:prstGeom prst="rect">
+                      <a:avLst/>
+                    </a:prstGeom>
+                  </pic:spPr>
+                </pic:pic>
+              </a:graphicData>
+            </a:graphic>
+          </wp:inline>
+        </w:drawing>
+      </w:r>
+    </w:p>
+    <w:p>
+      <w:r>
+        <w:t>6. Órdenes del día de hoy con su estado y mesa asignada</w:t>
+      </w:r>
+    </w:p>
+    <w:p>
+      <w:r>
+        <w:t>7</w:t>
+      </w:r>
+      <w:r>
+        <w:t>-</w:t>
+      </w:r>
+      <w:r>
+        <w:t xml:space="preserve"> Proveedores con la cantidad de ingredientes que suministran</w:t>
+      </w:r>
+    </w:p>
+    <w:p>
+      <w:r>
+        <w:lastRenderedPageBreak/>
+        <w:drawing>
+          <wp:inline distT="0" distB="0" distL="0" distR="0" wp14:anchorId="4D319FBE" wp14:editId="3FF0A2B4">
+            <wp:extent cx="5612130" cy="2878455"/>
+            <wp:effectExtent l="0" t="0" r="7620" b="0"/>
+            <wp:docPr id="18" name="Imagen 18" descr="Interfaz de usuario gráfica, Texto, Aplicación&#10;&#10;Descripción generada automáticamente"/>
+            <wp:cNvGraphicFramePr>
+              <a:graphicFrameLocks xmlns:a="http://schemas.openxmlformats.org/drawingml/2006/main" noChangeAspect="1"/>
+            </wp:cNvGraphicFramePr>
+            <a:graphic xmlns:a="http://schemas.openxmlformats.org/drawingml/2006/main">
+              <a:graphicData uri="http://schemas.openxmlformats.org/drawingml/2006/picture">
+                <pic:pic xmlns:pic="http://schemas.openxmlformats.org/drawingml/2006/picture">
+                  <pic:nvPicPr>
+                    <pic:cNvPr id="18" name="Imagen 18" descr="Interfaz de usuario gráfica, Texto, Aplicación&#10;&#10;Descripción generada automáticamente"/>
+                    <pic:cNvPicPr/>
+                  </pic:nvPicPr>
+                  <pic:blipFill>
+                    <a:blip r:embed="rId20"/>
+                    <a:stretch>
+                      <a:fillRect/>
+                    </a:stretch>
+                  </pic:blipFill>
+                  <pic:spPr>
+                    <a:xfrm>
+                      <a:off x="0" y="0"/>
+                      <a:ext cx="5612130" cy="2878455"/>
+                    </a:xfrm>
+                    <a:prstGeom prst="rect">
+                      <a:avLst/>
+                    </a:prstGeom>
+                  </pic:spPr>
+                </pic:pic>
+              </a:graphicData>
+            </a:graphic>
+          </wp:inline>
+        </w:drawing>
+      </w:r>
+    </w:p>
+    <w:p>
+      <w:r>
+        <w:t>8-</w:t>
+      </w:r>
+      <w:r>
+        <w:t xml:space="preserve"> Los 10 platillos más vendidos</w:t>
+      </w:r>
+    </w:p>
+    <w:p>
+      <w:r>
+        <w:drawing>
+          <wp:inline distT="0" distB="0" distL="0" distR="0" wp14:anchorId="5F0F96ED" wp14:editId="79F5A72C">
+            <wp:extent cx="5612130" cy="2045970"/>
+            <wp:effectExtent l="0" t="0" r="7620" b="0"/>
+            <wp:docPr id="19" name="Imagen 19" descr="Interfaz de usuario gráfica, Texto, Aplicación&#10;&#10;Descripción generada automáticamente"/>
+            <wp:cNvGraphicFramePr>
+              <a:graphicFrameLocks xmlns:a="http://schemas.openxmlformats.org/drawingml/2006/main" noChangeAspect="1"/>
+            </wp:cNvGraphicFramePr>
+            <a:graphic xmlns:a="http://schemas.openxmlformats.org/drawingml/2006/main">
+              <a:graphicData uri="http://schemas.openxmlformats.org/drawingml/2006/picture">
+                <pic:pic xmlns:pic="http://schemas.openxmlformats.org/drawingml/2006/picture">
+                  <pic:nvPicPr>
+                    <pic:cNvPr id="19" name="Imagen 19" descr="Interfaz de usuario gráfica, Texto, Aplicación&#10;&#10;Descripción generada automáticamente"/>
+                    <pic:cNvPicPr/>
+                  </pic:nvPicPr>
+                  <pic:blipFill>
+                    <a:blip r:embed="rId21"/>
+                    <a:stretch>
+                      <a:fillRect/>
+                    </a:stretch>
+                  </pic:blipFill>
+                  <pic:spPr>
+                    <a:xfrm>
+                      <a:off x="0" y="0"/>
+                      <a:ext cx="5612130" cy="2045970"/>
+                    </a:xfrm>
+                    <a:prstGeom prst="rect">
+                      <a:avLst/>
+                    </a:prstGeom>
+                  </pic:spPr>
+                </pic:pic>
+              </a:graphicData>
+            </a:graphic>
+          </wp:inline>
+        </w:drawing>
+      </w:r>
+    </w:p>
+    <w:p>
+      <w:r>
+        <w:t>9</w:t>
+      </w:r>
+      <w:r>
+        <w:t>-</w:t>
+      </w:r>
+      <w:r>
+        <w:t xml:space="preserve"> Ventas mensuales del último semestre</w:t>
+      </w:r>
+    </w:p>
+    <w:p>
+      <w:r>
+        <w:t>10</w:t>
+      </w:r>
+      <w:r>
+        <w:t>-</w:t>
+      </w:r>
+      <w:r>
+        <w:t>Meseros con mayor número de órdenes y propinas acumuladas</w:t>
+      </w:r>
+    </w:p>
+    <w:p>
+      <w:r>
+        <w:lastRenderedPageBreak/>
+        <w:drawing>
+          <wp:inline distT="0" distB="0" distL="0" distR="0" wp14:anchorId="5CB8DF68" wp14:editId="6E668F81">
+            <wp:extent cx="5612130" cy="2392680"/>
+            <wp:effectExtent l="0" t="0" r="7620" b="7620"/>
+            <wp:docPr id="20" name="Imagen 20" descr="Interfaz de usuario gráfica, Texto&#10;&#10;Descripción generada automáticamente"/>
+            <wp:cNvGraphicFramePr>
+              <a:graphicFrameLocks xmlns:a="http://schemas.openxmlformats.org/drawingml/2006/main" noChangeAspect="1"/>
+            </wp:cNvGraphicFramePr>
+            <a:graphic xmlns:a="http://schemas.openxmlformats.org/drawingml/2006/main">
+              <a:graphicData uri="http://schemas.openxmlformats.org/drawingml/2006/picture">
+                <pic:pic xmlns:pic="http://schemas.openxmlformats.org/drawingml/2006/picture">
+                  <pic:nvPicPr>
+                    <pic:cNvPr id="20" name="Imagen 20" descr="Interfaz de usuario gráfica, Texto&#10;&#10;Descripción generada automáticamente"/>
+                    <pic:cNvPicPr/>
+                  </pic:nvPicPr>
+                  <pic:blipFill>
+                    <a:blip r:embed="rId22"/>
+                    <a:stretch>
+                      <a:fillRect/>
+                    </a:stretch>
+                  </pic:blipFill>
+                  <pic:spPr>
+                    <a:xfrm>
+                      <a:off x="0" y="0"/>
+                      <a:ext cx="5612130" cy="2392680"/>
+                    </a:xfrm>
+                    <a:prstGeom prst="rect">
+                      <a:avLst/>
+                    </a:prstGeom>
+                  </pic:spPr>
+                </pic:pic>
+              </a:graphicData>
+            </a:graphic>
+          </wp:inline>
+        </w:drawing>
+      </w:r>
     </w:p>
     <w:p/>
     <w:sectPr>
@@ -429,8 +920,105 @@
 </w:document>
 </file>
 
+<file path=word/numbering.xml><?xml version="1.0" encoding="utf-8"?>
+<w:numbering xmlns:wpc="http://schemas.microsoft.com/office/word/2010/wordprocessingCanvas" xmlns:cx="http://schemas.microsoft.com/office/drawing/2014/chartex" xmlns:cx1="http://schemas.microsoft.com/office/drawing/2015/9/8/chartex" xmlns:cx2="http://schemas.microsoft.com/office/drawing/2015/10/21/chartex" xmlns:cx3="http://schemas.microsoft.com/office/drawing/2016/5/9/chartex" xmlns:cx4="http://schemas.microsoft.com/office/drawing/2016/5/10/chartex" xmlns:cx5="http://schemas.microsoft.com/office/drawing/2016/5/11/chartex" xmlns:cx6="http://schemas.microsoft.com/office/drawing/2016/5/12/chartex" xmlns:cx7="http://schemas.microsoft.com/office/drawing/2016/5/13/chartex" xmlns:cx8="http://schemas.microsoft.com/office/drawing/2016/5/14/chartex" xmlns:mc="http://schemas.openxmlformats.org/markup-compatibility/2006" xmlns:aink="http://schemas.microsoft.com/office/drawing/2016/ink" xmlns:am3d="http://schemas.microsoft.com/office/drawing/2017/model3d" xmlns:o="urn:schemas-microsoft-com:office:office" xmlns:oel="http://schemas.microsoft.com/office/2019/extlst" xmlns:r="http://schemas.openxmlformats.org/officeDocument/2006/relationships" xmlns:m="http://schemas.openxmlformats.org/officeDocument/2006/math" xmlns:v="urn:schemas-microsoft-com:vml" xmlns:wp14="http://schemas.microsoft.com/office/word/2010/wordprocessingDrawing" xmlns:wp="http://schemas.openxmlformats.org/drawingml/2006/wordprocessingDrawing" xmlns:w10="urn:schemas-microsoft-com:office:word" xmlns:w="http://schemas.openxmlformats.org/wordprocessingml/2006/main" xmlns:w14="http://schemas.microsoft.com/office/word/2010/wordml" xmlns:w15="http://schemas.microsoft.com/office/word/2012/wordml" xmlns:w16cex="http://schemas.microsoft.com/office/word/2018/wordml/cex" xmlns:w16cid="http://schemas.microsoft.com/office/word/2016/wordml/cid" xmlns:w16="http://schemas.microsoft.com/office/word/2018/wordml" xmlns:w16sdtdh="http://schemas.microsoft.com/office/word/2020/wordml/sdtdatahash" xmlns:w16se="http://schemas.microsoft.com/office/word/2015/wordml/symex" xmlns:wpg="http://schemas.microsoft.com/office/word/2010/wordprocessingGroup" xmlns:wpi="http://schemas.microsoft.com/office/word/2010/wordprocessingInk" xmlns:wne="http://schemas.microsoft.com/office/word/2006/wordml" xmlns:wps="http://schemas.microsoft.com/office/word/2010/wordprocessingShape" mc:Ignorable="w14 w15 w16se w16cid w16 w16cex w16sdtdh wp14">
+  <w:abstractNum w:abstractNumId="0" w15:restartNumberingAfterBreak="0">
+    <w:nsid w:val="04CD577C"/>
+    <w:multiLevelType w:val="hybridMultilevel"/>
+    <w:tmpl w:val="490E3586"/>
+    <w:lvl w:ilvl="0" w:tplc="0C706392">
+      <w:start w:val="1"/>
+      <w:numFmt w:val="decimal"/>
+      <w:lvlText w:val="%1."/>
+      <w:lvlJc w:val="left"/>
+      <w:pPr>
+        <w:ind w:left="720" w:hanging="360"/>
+      </w:pPr>
+      <w:rPr>
+        <w:rFonts w:hint="default"/>
+      </w:rPr>
+    </w:lvl>
+    <w:lvl w:ilvl="1" w:tplc="080A0019" w:tentative="1">
+      <w:start w:val="1"/>
+      <w:numFmt w:val="lowerLetter"/>
+      <w:lvlText w:val="%2."/>
+      <w:lvlJc w:val="left"/>
+      <w:pPr>
+        <w:ind w:left="1440" w:hanging="360"/>
+      </w:pPr>
+    </w:lvl>
+    <w:lvl w:ilvl="2" w:tplc="080A001B" w:tentative="1">
+      <w:start w:val="1"/>
+      <w:numFmt w:val="lowerRoman"/>
+      <w:lvlText w:val="%3."/>
+      <w:lvlJc w:val="right"/>
+      <w:pPr>
+        <w:ind w:left="2160" w:hanging="180"/>
+      </w:pPr>
+    </w:lvl>
+    <w:lvl w:ilvl="3" w:tplc="080A000F" w:tentative="1">
+      <w:start w:val="1"/>
+      <w:numFmt w:val="decimal"/>
+      <w:lvlText w:val="%4."/>
+      <w:lvlJc w:val="left"/>
+      <w:pPr>
+        <w:ind w:left="2880" w:hanging="360"/>
+      </w:pPr>
+    </w:lvl>
+    <w:lvl w:ilvl="4" w:tplc="080A0019" w:tentative="1">
+      <w:start w:val="1"/>
+      <w:numFmt w:val="lowerLetter"/>
+      <w:lvlText w:val="%5."/>
+      <w:lvlJc w:val="left"/>
+      <w:pPr>
+        <w:ind w:left="3600" w:hanging="360"/>
+      </w:pPr>
+    </w:lvl>
+    <w:lvl w:ilvl="5" w:tplc="080A001B" w:tentative="1">
+      <w:start w:val="1"/>
+      <w:numFmt w:val="lowerRoman"/>
+      <w:lvlText w:val="%6."/>
+      <w:lvlJc w:val="right"/>
+      <w:pPr>
+        <w:ind w:left="4320" w:hanging="180"/>
+      </w:pPr>
+    </w:lvl>
+    <w:lvl w:ilvl="6" w:tplc="080A000F" w:tentative="1">
+      <w:start w:val="1"/>
+      <w:numFmt w:val="decimal"/>
+      <w:lvlText w:val="%7."/>
+      <w:lvlJc w:val="left"/>
+      <w:pPr>
+        <w:ind w:left="5040" w:hanging="360"/>
+      </w:pPr>
+    </w:lvl>
+    <w:lvl w:ilvl="7" w:tplc="080A0019" w:tentative="1">
+      <w:start w:val="1"/>
+      <w:numFmt w:val="lowerLetter"/>
+      <w:lvlText w:val="%8."/>
+      <w:lvlJc w:val="left"/>
+      <w:pPr>
+        <w:ind w:left="5760" w:hanging="360"/>
+      </w:pPr>
+    </w:lvl>
+    <w:lvl w:ilvl="8" w:tplc="080A001B" w:tentative="1">
+      <w:start w:val="1"/>
+      <w:numFmt w:val="lowerRoman"/>
+      <w:lvlText w:val="%9."/>
+      <w:lvlJc w:val="right"/>
+      <w:pPr>
+        <w:ind w:left="6480" w:hanging="180"/>
+      </w:pPr>
+    </w:lvl>
+  </w:abstractNum>
+  <w:num w:numId="1" w16cid:durableId="847447820">
+    <w:abstractNumId w:val="0"/>
+  </w:num>
+</w:numbering>
+</file>
+
 <file path=word/styles.xml><?xml version="1.0" encoding="utf-8"?>
-<w:styles xmlns:mc="http://schemas.openxmlformats.org/markup-compatibility/2006" xmlns:r="http://schemas.openxmlformats.org/officeDocument/2006/relationships" xmlns:w="http://schemas.openxmlformats.org/wordprocessingml/2006/main" xmlns:w14="http://schemas.microsoft.com/office/word/2010/wordml" xmlns:w15="http://schemas.microsoft.com/office/word/2012/wordml" xmlns:w16se="http://schemas.microsoft.com/office/word/2015/wordml/symex" mc:Ignorable="w14 w15 w16se">
+<w:styles xmlns:mc="http://schemas.openxmlformats.org/markup-compatibility/2006" xmlns:r="http://schemas.openxmlformats.org/officeDocument/2006/relationships" xmlns:w="http://schemas.openxmlformats.org/wordprocessingml/2006/main" xmlns:w14="http://schemas.microsoft.com/office/word/2010/wordml" xmlns:w15="http://schemas.microsoft.com/office/word/2012/wordml" xmlns:w16cex="http://schemas.microsoft.com/office/word/2018/wordml/cex" xmlns:w16cid="http://schemas.microsoft.com/office/word/2016/wordml/cid" xmlns:w16="http://schemas.microsoft.com/office/word/2018/wordml" xmlns:w16sdtdh="http://schemas.microsoft.com/office/word/2020/wordml/sdtdatahash" xmlns:w16se="http://schemas.microsoft.com/office/word/2015/wordml/symex" mc:Ignorable="w14 w15 w16se w16cid w16 w16cex w16sdtdh">
   <w:docDefaults>
     <w:rPrDefault>
       <w:rPr>
@@ -446,7 +1034,7 @@
       </w:pPr>
     </w:pPrDefault>
   </w:docDefaults>
-  <w:latentStyles w:defLockedState="0" w:defUIPriority="99" w:defSemiHidden="0" w:defUnhideWhenUsed="0" w:defQFormat="0" w:count="371">
+  <w:latentStyles w:defLockedState="0" w:defUIPriority="99" w:defSemiHidden="0" w:defUnhideWhenUsed="0" w:defQFormat="0" w:count="376">
     <w:lsdException w:name="Normal" w:uiPriority="0" w:qFormat="1"/>
     <w:lsdException w:name="heading 1" w:uiPriority="9" w:qFormat="1"/>
     <w:lsdException w:name="heading 2" w:semiHidden="1" w:uiPriority="9" w:unhideWhenUsed="1" w:qFormat="1"/>
@@ -552,7 +1140,6 @@
     <w:lsdException w:name="HTML Sample" w:semiHidden="1" w:unhideWhenUsed="1"/>
     <w:lsdException w:name="HTML Typewriter" w:semiHidden="1" w:unhideWhenUsed="1"/>
     <w:lsdException w:name="HTML Variable" w:semiHidden="1" w:unhideWhenUsed="1"/>
-    <w:lsdException w:name="Normal Table" w:semiHidden="1" w:unhideWhenUsed="1"/>
     <w:lsdException w:name="annotation subject" w:semiHidden="1" w:unhideWhenUsed="1"/>
     <w:lsdException w:name="No List" w:semiHidden="1" w:unhideWhenUsed="1"/>
     <w:lsdException w:name="Outline List 1" w:semiHidden="1" w:unhideWhenUsed="1"/>
@@ -595,11 +1182,8 @@
     <w:lsdException w:name="Table Contemporary" w:semiHidden="1" w:unhideWhenUsed="1"/>
     <w:lsdException w:name="Table Elegant" w:semiHidden="1" w:unhideWhenUsed="1"/>
     <w:lsdException w:name="Table Professional" w:semiHidden="1" w:unhideWhenUsed="1"/>
-    <w:lsdException w:name="Table Subtle 1" w:semiHidden="1" w:unhideWhenUsed="1"/>
     <w:lsdException w:name="Table Subtle 2" w:semiHidden="1" w:unhideWhenUsed="1"/>
     <w:lsdException w:name="Table Web 1" w:semiHidden="1" w:unhideWhenUsed="1"/>
-    <w:lsdException w:name="Table Web 2" w:semiHidden="1" w:unhideWhenUsed="1"/>
-    <w:lsdException w:name="Table Web 3" w:semiHidden="1" w:unhideWhenUsed="1"/>
     <w:lsdException w:name="Balloon Text" w:semiHidden="1" w:unhideWhenUsed="1"/>
     <w:lsdException w:name="Table Grid" w:uiPriority="39"/>
     <w:lsdException w:name="Table Theme" w:semiHidden="1" w:unhideWhenUsed="1"/>
@@ -818,6 +1402,11 @@
     <w:lsdException w:name="List Table 5 Dark Accent 6" w:uiPriority="50"/>
     <w:lsdException w:name="List Table 6 Colorful Accent 6" w:uiPriority="51"/>
     <w:lsdException w:name="List Table 7 Colorful Accent 6" w:uiPriority="52"/>
+    <w:lsdException w:name="Mention" w:semiHidden="1" w:unhideWhenUsed="1"/>
+    <w:lsdException w:name="Smart Hyperlink" w:semiHidden="1" w:unhideWhenUsed="1"/>
+    <w:lsdException w:name="Hashtag" w:semiHidden="1" w:unhideWhenUsed="1"/>
+    <w:lsdException w:name="Unresolved Mention" w:semiHidden="1" w:unhideWhenUsed="1"/>
+    <w:lsdException w:name="Smart Link" w:semiHidden="1" w:unhideWhenUsed="1"/>
   </w:latentStyles>
   <w:style w:type="paragraph" w:default="1" w:styleId="Normal">
     <w:name w:val="Normal"/>
@@ -849,6 +1438,17 @@
     <w:uiPriority w:val="99"/>
     <w:semiHidden/>
     <w:unhideWhenUsed/>
+  </w:style>
+  <w:style w:type="paragraph" w:styleId="Prrafodelista">
+    <w:name w:val="List Paragraph"/>
+    <w:basedOn w:val="Normal"/>
+    <w:uiPriority w:val="34"/>
+    <w:qFormat/>
+    <w:rsid w:val="00033CB4"/>
+    <w:pPr>
+      <w:ind w:left="720"/>
+      <w:contextualSpacing/>
+    </w:pPr>
   </w:style>
 </w:styles>
 </file>

</xml_diff>